<commit_message>
Add adapted visual variants for paragraph 1 companions
</commit_message>
<xml_diff>
--- a/Boek 1 - Grondslagen, vraag en aanbod/1.1 Hoofdstuk Economisch denken en rekenen/1.1.1 Schaarste en economisch denken/1.1.1 Schaarste en economisch denken – begeleide inoefening – antwoorden.docx
+++ b/Boek 1 - Grondslagen, vraag en aanbod/1.1 Hoofdstuk Economisch denken en rekenen/1.1.1 Schaarste en economisch denken/1.1.1 Schaarste en economisch denken – begeleide inoefening – antwoorden.docx
@@ -2317,9 +2317,9 @@
       <w:r>
         <w:drawing>
           <wp:inline distT="0" distB="0" distL="0" distR="0">
-            <wp:extent cx="4953000" cy="3048000"/>
+            <wp:extent cx="4953000" cy="3171825"/>
             <wp:effectExtent t="0" r="0" b="0" l="0"/>
-            <wp:docPr id="1" name="1.1.1_fig_2.png" descr="asset:1.1.1_fig_2" title="1.1.1_fig_2.png"/>
+            <wp:docPr id="1" name="1.1.1_fig_2_doc.png" descr="asset:1.1.1_fig_2" title="1.1.1_fig_2"/>
             <wp:cNvGraphicFramePr>
               <a:graphicFrameLocks xmlns:a="http://schemas.openxmlformats.org/drawingml/2006/main" noChangeAspect="1"/>
             </wp:cNvGraphicFramePr>
@@ -2342,7 +2342,7 @@
                   <pic:spPr bwMode="auto">
                     <a:xfrm>
                       <a:off x="0" y="0"/>
-                      <a:ext cx="4953000" cy="3048000"/>
+                      <a:ext cx="4953000" cy="3171825"/>
                     </a:xfrm>
                     <a:prstGeom prst="rect">
                       <a:avLst/>
@@ -3676,9 +3676,9 @@
       <w:r>
         <w:drawing>
           <wp:inline distT="0" distB="0" distL="0" distR="0">
-            <wp:extent cx="4953000" cy="3048000"/>
+            <wp:extent cx="4953000" cy="3171825"/>
             <wp:effectExtent t="0" r="0" b="0" l="0"/>
-            <wp:docPr id="1" name="1.1.1_fig_2.png" descr="asset:1.1.1_fig_2" title="1.1.1_fig_2.png"/>
+            <wp:docPr id="1" name="1.1.1_fig_2_doc.png" descr="asset:1.1.1_fig_2" title="1.1.1_fig_2"/>
             <wp:cNvGraphicFramePr>
               <a:graphicFrameLocks xmlns:a="http://schemas.openxmlformats.org/drawingml/2006/main" noChangeAspect="1"/>
             </wp:cNvGraphicFramePr>
@@ -3701,7 +3701,7 @@
                   <pic:spPr bwMode="auto">
                     <a:xfrm>
                       <a:off x="0" y="0"/>
-                      <a:ext cx="4953000" cy="3048000"/>
+                      <a:ext cx="4953000" cy="3171825"/>
                     </a:xfrm>
                     <a:prstGeom prst="rect">
                       <a:avLst/>
@@ -5187,9 +5187,9 @@
       <w:r>
         <w:drawing>
           <wp:inline distT="0" distB="0" distL="0" distR="0">
-            <wp:extent cx="4953000" cy="3048000"/>
+            <wp:extent cx="4953000" cy="3171825"/>
             <wp:effectExtent t="0" r="0" b="0" l="0"/>
-            <wp:docPr id="1" name="1.1.1_we_1.png" descr="asset:1.1.1_we_1" title="1.1.1_we_1.png"/>
+            <wp:docPr id="1" name="1.1.1_we_1_doc.png" descr="asset:1.1.1_we_1" title="1.1.1_we_1"/>
             <wp:cNvGraphicFramePr>
               <a:graphicFrameLocks xmlns:a="http://schemas.openxmlformats.org/drawingml/2006/main" noChangeAspect="1"/>
             </wp:cNvGraphicFramePr>
@@ -5212,7 +5212,7 @@
                   <pic:spPr bwMode="auto">
                     <a:xfrm>
                       <a:off x="0" y="0"/>
-                      <a:ext cx="4953000" cy="3048000"/>
+                      <a:ext cx="4953000" cy="3171825"/>
                     </a:xfrm>
                     <a:prstGeom prst="rect">
                       <a:avLst/>

</xml_diff>